<commit_message>
Liner contest Figure 1: path-traced clouds, audible vs silent on the sofa (ParaView), annotated in FIGSTYLE; in the draft and the Word file
Co-Authored-By: Claude <noreply@anthropic.com>
</commit_message>
<xml_diff>
--- a/manuscript/liner_contest/제1회 라이너 스콜라 연구공모전_소리 없는 방귀가 더 독한가_초안.docx
+++ b/manuscript/liner_contest/제1회 라이너 스콜라 연구공모전_소리 없는 방귀가 더 독한가_초안.docx
@@ -1495,22 +1495,78 @@
           <w:sz w:val="20"/>
           <w:szCs w:val="20"/>
         </w:rPr>
-        <w:t xml:space="preserve"> 저자의 CFD에서는 방출 운동량과 경계층 운동량의 비(Π)가 경로를 갈랐다. Π는 방출이 몸의 상승 기류를 "밀어낼" 만큼 센지를 나타내는 무차원 수로, 1보다 작으면 기류에 실려 가고 훨씬 크면 기류를 뚫고 나간다. 소파에 앉은 경우 Π가 가장 작은 느린 조용한 방출(Π≈0.5)은 경계층에 실려 방출자 쪽으로 올라갔고, 옆 사람 코에는 같은 질량(92 mL) 기준 OAV 0.05–0.23에 그쳤다. 반면 Π가 수백인 큰 소리 방출은 경계층을 뚫고 나가 옆 사람 코에 OAV 6–12로 닿았다. 실제 방출량으로 보면 바른 자세 소파에서 큰 소리 방출은 옆 사람 코에 OAV 16.9, 큰 조용한 방출은 0.09였다. 맨몸 다섯 장면 모두에서 옆 사람 코에 탐지 역치(OAV 1)를 넘은 조용한 방출은 없었다. 바지를 입히면 소리 나는 방출이 오히려 강해졌다. 마주 선 두 사람에서는 방출 종류와 관계없이 옆 사람 코의 농도가 낮았다. 서 있으면 엉덩이에서 코까지의 높이가 크고, 상대가 몸의 뒤쪽이 아니라 앞쪽에 있기 때문이다. 즉 Π 하나로 경로가 모두 정해지지는 않으며, 사람 사이의 배치와 거리가 두 번째 변수가 된다.</w:t>
-      </w:r>
-    </w:p>
-    <w:p>
-      <w:pPr>
-        <w:spacing w:after="160" w:before="120"/>
+        <w:t xml:space="preserve"> 저자의 CFD에서는 방출 운동량과 경계층 운동량의 비(Π)가 경로를 갈랐다. Π는 방출이 몸의 상승 기류를 "밀어낼" 만큼 센지를 나타내는 무차원 수로, 1보다 작으면 기류에 실려 가고 훨씬 크면 기류를 뚫고 나간다. 소파에 앉은 경우 Π가 가장 작은 느린 조용한 방출(Π≈0.5)은 경계층에 실려 방출자 쪽으로 올라갔고, 옆 사람 코에는 같은 질량(92 mL) 기준 OAV 0.05–0.23에 그쳤다. 반면 Π가 수백인 큰 소리 방출은 경계층을 뚫고 나가 옆 사람 코에 OAV 6–12로 닿았다. 실제 방출량으로 보면 바른 자세 소파에서 큰 소리 방출은 옆 사람 코에 OAV 16.9, 큰 조용한 방출은 0.09였다. 맨몸 다섯 장면 모두에서 옆 사람 코에 탐지 역치(OAV 1)를 넘은 조용한 방출은 없었다. 바지를 입히면 소리 나는 방출이 오히려 강해졌다. 그림 1은 같은 자세, 같은 시각의 두 방출을 비교한 것이다. 소리 나는 방출은 옆 사람 코에 OAV 15로 닿았고 방출자 코에는 3.8이었다. 조용한 방출은 정반대로 방출자 코에 OAV 22, 옆 사람 코에 0이었다. 조용한 방출이 경계층을 타고 방출자를 감싸며 천장까지 올라가는 모습이 그대로 보인다. 마주 선 두 사람에서는 방출 종류와 관계없이 옆 사람 코의 농도가 낮았다. 서 있으면 엉덩이에서 코까지의 높이가 크고, 상대가 몸의 뒤쪽이 아니라 앞쪽에 있기 때문이다. 즉 Π 하나로 경로가 모두 정해지지는 않으며, 사람 사이의 배치와 거리가 두 번째 변수가 된다.</w:t>
+      </w:r>
+    </w:p>
+    <w:p>
+      <w:pPr>
+        <w:keepNext/>
+        <w:spacing w:after="80" w:before="160"/>
         <w:jc w:val="center"/>
       </w:pPr>
       <w:r>
-        <w:rPr>
-          <w:rFonts w:ascii="Batang" w:cs="Batang" w:eastAsia="Batang" w:hAnsi="Batang"/>
-          <w:sz w:val="18"/>
-          <w:szCs w:val="18"/>
-          <w:highlight w:val="yellow"/>
-        </w:rPr>
-        <w:t xml:space="preserve">[그림 1 자리: 3D 뷰어에서 고른 장면. 소파에 앉은 두 사람, 조용한 방출 구름은 방출자 쪽으로 올라가고 소리 나는 방출 구름은 옆 사람에게 닿는 모습. 출처: 저자 시뮬레이션]</w:t>
+        <w:drawing>
+          <wp:inline distT="0" distB="0" distL="0" distR="0">
+            <wp:extent cx="5029200" cy="2714625"/>
+            <wp:effectExtent t="0" r="0" b="0" l="0"/>
+            <wp:docPr id="1" name=""/>
+            <wp:cNvGraphicFramePr>
+              <a:graphicFrameLocks xmlns:a="http://schemas.openxmlformats.org/drawingml/2006/main" noChangeAspect="1"/>
+            </wp:cNvGraphicFramePr>
+            <a:graphic xmlns:a="http://schemas.openxmlformats.org/drawingml/2006/main">
+              <a:graphicData uri="http://schemas.openxmlformats.org/drawingml/2006/picture">
+                <pic:pic xmlns:pic="http://schemas.openxmlformats.org/drawingml/2006/picture">
+                  <pic:nvPicPr>
+                    <pic:cNvPr id="0" name="" descr=""/>
+                    <pic:cNvPicPr>
+                      <a:picLocks noChangeAspect="1" noChangeArrowheads="1"/>
+                    </pic:cNvPicPr>
+                  </pic:nvPicPr>
+                  <pic:blipFill>
+                    <a:blip r:embed="rId9" cstate="none"/>
+                    <a:srcRect/>
+                    <a:stretch>
+                      <a:fillRect/>
+                    </a:stretch>
+                  </pic:blipFill>
+                  <pic:spPr bwMode="auto">
+                    <a:xfrm>
+                      <a:off x="0" y="0"/>
+                      <a:ext cx="5029200" cy="2714625"/>
+                    </a:xfrm>
+                    <a:prstGeom prst="rect">
+                      <a:avLst/>
+                    </a:prstGeom>
+                  </pic:spPr>
+                </pic:pic>
+              </a:graphicData>
+            </a:graphic>
+          </wp:inline>
+        </w:drawing>
+      </w:r>
+    </w:p>
+    <w:p>
+      <w:pPr>
+        <w:spacing w:after="200" w:before="40"/>
+        <w:jc w:val="left"/>
+      </w:pPr>
+      <w:r>
+        <w:rPr>
+          <w:rFonts w:ascii="Batang" w:cs="Batang" w:eastAsia="Batang" w:hAnsi="Batang"/>
+          <w:b/>
+          <w:bCs/>
+          <w:sz w:val="18"/>
+          <w:szCs w:val="18"/>
+        </w:rPr>
+        <w:t xml:space="preserve">그림 1.</w:t>
+      </w:r>
+      <w:r>
+        <w:rPr>
+          <w:rFonts w:ascii="Batang" w:cs="Batang" w:eastAsia="Batang" w:hAnsi="Batang"/>
+          <w:sz w:val="18"/>
+          <w:szCs w:val="18"/>
+        </w:rPr>
+        <w:t xml:space="preserve"> 소파에 약간(4.5°) 기대앉은 두 사람(방출자 주황, 옆 사람 파랑)에게서 방출 약 30초 뒤의 냄새 구름. (a) 소리 나는 방귀(A90, 279 mL), (b) 조용한 방귀(S90, 66 mL). 두 방출은 각 종류에서 출구 운동량이 90번째 백분위인 대표 방출이다. 연한 초록은 OAV 1(훈련된 판정단의 탐지 역치), 진한 초록은 OAV 20(주의하면 절반이 알아챔)의 등농도면이고, 숫자는 그 순간 코 위치의 OAV이다. 출처: 저자 시뮬레이션(OpenFOAM, RANS), ParaView로 렌더링.</w:t>
       </w:r>
     </w:p>
     <w:p>

</xml_diff>

<commit_message>
Liner contest draft: author, date and Liner Scholar use filled in; no placeholders left
Co-Authored-By: Claude <noreply@anthropic.com>
</commit_message>
<xml_diff>
--- a/manuscript/liner_contest/제1회 라이너 스콜라 연구공모전_소리 없는 방귀가 더 독한가_초안.docx
+++ b/manuscript/liner_contest/제1회 라이너 스콜라 연구공모전_소리 없는 방귀가 더 독한가_초안.docx
@@ -28,43 +28,8 @@
           <w:rFonts w:ascii="Batang" w:cs="Batang" w:eastAsia="Batang" w:hAnsi="Batang"/>
           <w:sz w:val="20"/>
           <w:szCs w:val="20"/>
-          <w:highlight w:val="yellow"/>
-        </w:rPr>
-        <w:t xml:space="preserve">[이름]</w:t>
-      </w:r>
-      <w:r>
-        <w:rPr>
-          <w:rFonts w:ascii="Batang" w:cs="Batang" w:eastAsia="Batang" w:hAnsi="Batang"/>
-          <w:sz w:val="20"/>
-          <w:szCs w:val="20"/>
-        </w:rPr>
-        <w:t xml:space="preserve"> · 작성일 2026년 </w:t>
-      </w:r>
-      <w:r>
-        <w:rPr>
-          <w:rFonts w:ascii="Batang" w:cs="Batang" w:eastAsia="Batang" w:hAnsi="Batang"/>
-          <w:sz w:val="20"/>
-          <w:szCs w:val="20"/>
-          <w:highlight w:val="yellow"/>
-        </w:rPr>
-        <w:t xml:space="preserve">[월]</w:t>
-      </w:r>
-      <w:r>
-        <w:rPr>
-          <w:rFonts w:ascii="Batang" w:cs="Batang" w:eastAsia="Batang" w:hAnsi="Batang"/>
-          <w:sz w:val="20"/>
-          <w:szCs w:val="20"/>
-        </w:rPr>
-        <w:t xml:space="preserve"> </w:t>
-      </w:r>
-      <w:r>
-        <w:rPr>
-          <w:rFonts w:ascii="Batang" w:cs="Batang" w:eastAsia="Batang" w:hAnsi="Batang"/>
-          <w:sz w:val="20"/>
-          <w:szCs w:val="20"/>
-          <w:highlight w:val="yellow"/>
-        </w:rPr>
-        <w:t xml:space="preserve">[일]</w:t>
+        </w:rPr>
+        <w:t xml:space="preserve">조찬영 · 작성일 2026년 10월 27일</w:t>
       </w:r>
     </w:p>
     <w:p>
@@ -278,24 +243,7 @@
           <w:sz w:val="20"/>
           <w:szCs w:val="20"/>
         </w:rPr>
-        <w:t xml:space="preserve"> 문헌은 OpenAlex와 PubMed에서 "flatus odour", "flatus composition", "human convective boundary layer", "odor threshold", "olfactory attention", "illusory correlation", "Berkson bias" 등의 검색어로 찾았다(검색 기간 2026년 10월). 모든 문헌은 DOI로 서지정보를 대조하고, 인용한 수치는 초록이나 원문에서 확인하였다. </w:t>
-      </w:r>
-      <w:r>
-        <w:rPr>
-          <w:rFonts w:ascii="Batang" w:cs="Batang" w:eastAsia="Batang" w:hAnsi="Batang"/>
-          <w:sz w:val="20"/>
-          <w:szCs w:val="20"/>
-          <w:highlight w:val="yellow"/>
-        </w:rPr>
-        <w:t xml:space="preserve">[라이너 스콜라 활용: 저자가 실제로 사용한 단계와 용도를 적는다. 예: 문헌 탐색 보완, 연구 간 결과 비교, 초안 다듬기.]</w:t>
-      </w:r>
-      <w:r>
-        <w:rPr>
-          <w:rFonts w:ascii="Batang" w:cs="Batang" w:eastAsia="Batang" w:hAnsi="Batang"/>
-          <w:sz w:val="20"/>
-          <w:szCs w:val="20"/>
-        </w:rPr>
-        <w:t xml:space="preserve"> 문헌 정리와 초안 작성에는 Claude(Anthropic)도 사용하였으며, 문헌의 실재와 인용 내용, 해석과 결론은 저자가 직접 확인하였다.</w:t>
+        <w:t xml:space="preserve"> 문헌은 OpenAlex와 PubMed에서 "flatus odour", "flatus composition", "human convective boundary layer", "odor threshold", "olfactory attention", "illusory correlation", "Berkson bias" 등의 검색어로 찾았다(검색 기간 2026년 10월). 모든 문헌은 DOI로 서지정보를 대조하고, 인용한 수치는 초록이나 원문에서 확인하였다. 연구 초기의 문헌 탐색에는 라이너 스콜라를 사용하였다. 문헌 정리와 초안 작성에는 Claude(Anthropic)도 사용하였으며, 문헌의 실재와 인용 내용, 해석과 결론은 저자가 직접 확인하였다.</w:t>
       </w:r>
     </w:p>
     <w:p>
@@ -4280,26 +4228,8 @@
           <w:rFonts w:ascii="Batang" w:cs="Batang" w:eastAsia="Batang" w:hAnsi="Batang"/>
           <w:sz w:val="18"/>
           <w:szCs w:val="18"/>
-          <w:highlight w:val="yellow"/>
-        </w:rPr>
-        <w:t xml:space="preserve">[저자]</w:t>
-      </w:r>
-      <w:r>
-        <w:rPr>
-          <w:rFonts w:ascii="Batang" w:cs="Batang" w:eastAsia="Batang" w:hAnsi="Batang"/>
-          <w:sz w:val="18"/>
-          <w:szCs w:val="18"/>
-        </w:rPr>
-        <w:t xml:space="preserve"> (2026). 미출간 시뮬레이션: 소파와 서 있는 두 사람의 방귀 확산 CFD(OpenFOAM 13, RANS)와 몬테카를로 계산. 동료 심사 전. </w:t>
-      </w:r>
-      <w:r>
-        <w:rPr>
-          <w:rFonts w:ascii="Batang" w:cs="Batang" w:eastAsia="Batang" w:hAnsi="Batang"/>
-          <w:sz w:val="18"/>
-          <w:szCs w:val="18"/>
-          <w:highlight w:val="yellow"/>
-        </w:rPr>
-        <w:t xml:space="preserve">[공개 저장소나 프리프린트가 생기면 주소 기입]</w:t>
+        </w:rPr>
+        <w:t xml:space="preserve">조찬영 (2026). 미출간 시뮬레이션: 소파와 서 있는 두 사람의 방귀 확산 CFD(OpenFOAM 13, RANS)와 몬테카를로 계산. 동료 심사 전.</w:t>
       </w:r>
     </w:p>
     <w:sectPr>

</xml_diff>